<commit_message>
feat: support multiple drivers, victims, third parties and witnesses in accident report
- Wrap each person table in the Word template in a docxtemplater loop that repeats the spacer paragraph so repeated tables no longer merge and rows stay together on one page
- Number the person headings in the Word document (e.g. DADOS DA TESTEMUNHA 1:) only when more than one entry exists and widen the heading column so numbered titles stay on one line
- Replace the static person fields with dynamic lists using the site's 3D buttons for adding and removing entries, with localStorage persistence that migrates the previous single-entry values
- Validate every filled driver, fall back to NÃO HOUVE for empty sections and join multiple names and CPFs in the spreadsheet row and floating box
</commit_message>
<xml_diff>
--- a/apps/acidentes/template.docx
+++ b/apps/acidentes/template.docx
@@ -3214,6 +3214,22 @@
       </w:tr>
     </w:tbl>
     <w:p/>
+    <w:p>
+      <w:pPr>
+        <w:spacing w:after="0" w:line="240" w:lineRule="auto"/>
+        <w:rPr>
+          <w:sz w:val="2"/>
+          <w:szCs w:val="2"/>
+        </w:rPr>
+      </w:pPr>
+      <w:r>
+        <w:rPr>
+          <w:sz w:val="2"/>
+          <w:szCs w:val="2"/>
+        </w:rPr>
+        <w:t>{#drivers}</w:t>
+      </w:r>
+    </w:p>
     <w:tbl>
       <w:tblPr>
         <w:tblStyle w:val="Tabelacomgrade"/>
@@ -3223,13 +3239,16 @@
       </w:tblPr>
       <w:tblGrid>
         <w:gridCol w:w="1384"/>
-        <w:gridCol w:w="2268"/>
-        <w:gridCol w:w="7030"/>
+        <w:gridCol w:w="3100"/>
+        <w:gridCol w:w="6198"/>
       </w:tblGrid>
       <w:tr>
-        <w:tc>
-          <w:tcPr>
-            <w:tcW w:w="3652" w:type="dxa"/>
+        <w:trPr>
+          <w:cantSplit/>
+        </w:trPr>
+        <w:tc>
+          <w:tcPr>
+            <w:tcW w:w="4484" w:type="dxa"/>
             <w:gridSpan w:val="2"/>
             <w:tcBorders>
               <w:top w:val="single" w:sz="4" w:space="0" w:color="auto"/>
@@ -3241,39 +3260,41 @@
           </w:tcPr>
           <w:p>
             <w:pPr>
-              <w:rPr>
-                <w:rFonts w:cstheme="minorHAnsi"/>
-                <w:b/>
-                <w:bCs/>
-                <w:sz w:val="20"/>
-                <w:szCs w:val="20"/>
-              </w:rPr>
-            </w:pPr>
-            <w:r>
-              <w:rPr>
-                <w:rFonts w:cstheme="minorHAnsi"/>
-                <w:b/>
-                <w:bCs/>
-                <w:sz w:val="20"/>
-                <w:szCs w:val="20"/>
-              </w:rPr>
-              <w:t>*DADOS DO OPERADOR DO COLETIVO:*</w:t>
-            </w:r>
-          </w:p>
-        </w:tc>
-        <w:tc>
-          <w:tcPr>
-            <w:tcW w:w="7030" w:type="dxa"/>
-            <w:tcBorders>
-              <w:top w:val="single" w:sz="4" w:space="0" w:color="auto"/>
-              <w:left w:val="single" w:sz="4" w:space="0" w:color="auto"/>
-              <w:bottom w:val="single" w:sz="4" w:space="0" w:color="auto"/>
-              <w:right w:val="single" w:sz="4" w:space="0" w:color="auto"/>
-            </w:tcBorders>
-            <w:vAlign w:val="center"/>
-          </w:tcPr>
-          <w:p>
-            <w:pPr>
+              <w:keepNext/>
+              <w:rPr>
+                <w:rFonts w:cstheme="minorHAnsi"/>
+                <w:b/>
+                <w:bCs/>
+                <w:sz w:val="20"/>
+                <w:szCs w:val="20"/>
+              </w:rPr>
+            </w:pPr>
+            <w:r>
+              <w:rPr>
+                <w:rFonts w:cstheme="minorHAnsi"/>
+                <w:b/>
+                <w:bCs/>
+                <w:sz w:val="20"/>
+                <w:szCs w:val="20"/>
+              </w:rPr>
+              <w:t>*DADOS DO OPERADOR DO COLETIVO{driverNum}:*</w:t>
+            </w:r>
+          </w:p>
+        </w:tc>
+        <w:tc>
+          <w:tcPr>
+            <w:tcW w:w="6198" w:type="dxa"/>
+            <w:tcBorders>
+              <w:top w:val="single" w:sz="4" w:space="0" w:color="auto"/>
+              <w:left w:val="single" w:sz="4" w:space="0" w:color="auto"/>
+              <w:bottom w:val="single" w:sz="4" w:space="0" w:color="auto"/>
+              <w:right w:val="single" w:sz="4" w:space="0" w:color="auto"/>
+            </w:tcBorders>
+            <w:vAlign w:val="center"/>
+          </w:tcPr>
+          <w:p>
+            <w:pPr>
+              <w:keepNext/>
               <w:rPr>
                 <w:rFonts w:cstheme="minorHAnsi"/>
                 <w:sz w:val="20"/>
@@ -3310,6 +3331,9 @@
         </w:tc>
       </w:tr>
       <w:tr>
+        <w:trPr>
+          <w:cantSplit/>
+        </w:trPr>
         <w:tc>
           <w:tcPr>
             <w:tcW w:w="1384" w:type="dxa"/>
@@ -3323,6 +3347,7 @@
           </w:tcPr>
           <w:p>
             <w:pPr>
+              <w:keepNext/>
               <w:rPr>
                 <w:rFonts w:cstheme="minorHAnsi"/>
                 <w:b/>
@@ -3345,17 +3370,18 @@
         </w:tc>
         <w:tc>
           <w:tcPr>
-            <w:tcW w:w="2268" w:type="dxa"/>
-            <w:tcBorders>
-              <w:top w:val="single" w:sz="4" w:space="0" w:color="auto"/>
-              <w:left w:val="single" w:sz="4" w:space="0" w:color="auto"/>
-              <w:bottom w:val="single" w:sz="4" w:space="0" w:color="auto"/>
-              <w:right w:val="single" w:sz="4" w:space="0" w:color="auto"/>
-            </w:tcBorders>
-            <w:vAlign w:val="center"/>
-          </w:tcPr>
-          <w:p>
-            <w:pPr>
+            <w:tcW w:w="3100" w:type="dxa"/>
+            <w:tcBorders>
+              <w:top w:val="single" w:sz="4" w:space="0" w:color="auto"/>
+              <w:left w:val="single" w:sz="4" w:space="0" w:color="auto"/>
+              <w:bottom w:val="single" w:sz="4" w:space="0" w:color="auto"/>
+              <w:right w:val="single" w:sz="4" w:space="0" w:color="auto"/>
+            </w:tcBorders>
+            <w:vAlign w:val="center"/>
+          </w:tcPr>
+          <w:p>
+            <w:pPr>
+              <w:keepNext/>
               <w:rPr>
                 <w:rFonts w:cstheme="minorHAnsi"/>
                 <w:sz w:val="20"/>
@@ -3392,7 +3418,7 @@
         </w:tc>
         <w:tc>
           <w:tcPr>
-            <w:tcW w:w="7030" w:type="dxa"/>
+            <w:tcW w:w="6198" w:type="dxa"/>
             <w:tcBorders>
               <w:top w:val="single" w:sz="4" w:space="0" w:color="auto"/>
               <w:left w:val="single" w:sz="4" w:space="0" w:color="auto"/>
@@ -3403,6 +3429,7 @@
           </w:tcPr>
           <w:p>
             <w:pPr>
+              <w:keepNext/>
               <w:rPr>
                 <w:rFonts w:cstheme="minorHAnsi"/>
                 <w:b/>
@@ -3415,6 +3442,9 @@
         </w:tc>
       </w:tr>
       <w:tr>
+        <w:trPr>
+          <w:cantSplit/>
+        </w:trPr>
         <w:tc>
           <w:tcPr>
             <w:tcW w:w="1384" w:type="dxa"/>
@@ -3466,7 +3496,7 @@
         </w:tc>
         <w:tc>
           <w:tcPr>
-            <w:tcW w:w="2268" w:type="dxa"/>
+            <w:tcW w:w="3100" w:type="dxa"/>
             <w:tcBorders>
               <w:top w:val="single" w:sz="4" w:space="0" w:color="auto"/>
               <w:left w:val="single" w:sz="4" w:space="0" w:color="auto"/>
@@ -3513,7 +3543,7 @@
         </w:tc>
         <w:tc>
           <w:tcPr>
-            <w:tcW w:w="7030" w:type="dxa"/>
+            <w:tcW w:w="6198" w:type="dxa"/>
             <w:tcBorders>
               <w:top w:val="nil"/>
               <w:left w:val="single" w:sz="4" w:space="0" w:color="auto"/>
@@ -3535,6 +3565,38 @@
       </w:tr>
     </w:tbl>
     <w:p/>
+    <w:p>
+      <w:pPr>
+        <w:spacing w:after="0" w:line="240" w:lineRule="auto"/>
+        <w:rPr>
+          <w:sz w:val="2"/>
+          <w:szCs w:val="2"/>
+        </w:rPr>
+      </w:pPr>
+      <w:r>
+        <w:rPr>
+          <w:sz w:val="2"/>
+          <w:szCs w:val="2"/>
+        </w:rPr>
+        <w:t>{/drivers}</w:t>
+      </w:r>
+    </w:p>
+    <w:p>
+      <w:pPr>
+        <w:spacing w:after="0" w:line="240" w:lineRule="auto"/>
+        <w:rPr>
+          <w:sz w:val="2"/>
+          <w:szCs w:val="2"/>
+        </w:rPr>
+      </w:pPr>
+      <w:r>
+        <w:rPr>
+          <w:sz w:val="2"/>
+          <w:szCs w:val="2"/>
+        </w:rPr>
+        <w:t>{#thirdParties}</w:t>
+      </w:r>
+    </w:p>
     <w:tbl>
       <w:tblPr>
         <w:tblStyle w:val="Tabelacomgrade"/>
@@ -3551,24 +3613,28 @@
         <w:tblLook w:val="04A0" w:firstRow="1" w:lastRow="0" w:firstColumn="1" w:lastColumn="0" w:noHBand="0" w:noVBand="1"/>
       </w:tblPr>
       <w:tblGrid>
-        <w:gridCol w:w="2376"/>
+        <w:gridCol w:w="3300"/>
         <w:gridCol w:w="3261"/>
-        <w:gridCol w:w="5045"/>
+        <w:gridCol w:w="4121"/>
       </w:tblGrid>
       <w:tr>
-        <w:tc>
-          <w:tcPr>
-            <w:tcW w:w="2376" w:type="dxa"/>
-            <w:tcBorders>
-              <w:top w:val="single" w:sz="4" w:space="0" w:color="auto"/>
-              <w:left w:val="single" w:sz="4" w:space="0" w:color="auto"/>
-              <w:bottom w:val="single" w:sz="4" w:space="0" w:color="auto"/>
-              <w:right w:val="single" w:sz="4" w:space="0" w:color="auto"/>
-            </w:tcBorders>
-            <w:vAlign w:val="center"/>
-          </w:tcPr>
-          <w:p>
-            <w:pPr>
+        <w:trPr>
+          <w:cantSplit/>
+        </w:trPr>
+        <w:tc>
+          <w:tcPr>
+            <w:tcW w:w="3300" w:type="dxa"/>
+            <w:tcBorders>
+              <w:top w:val="single" w:sz="4" w:space="0" w:color="auto"/>
+              <w:left w:val="single" w:sz="4" w:space="0" w:color="auto"/>
+              <w:bottom w:val="single" w:sz="4" w:space="0" w:color="auto"/>
+              <w:right w:val="single" w:sz="4" w:space="0" w:color="auto"/>
+            </w:tcBorders>
+            <w:vAlign w:val="center"/>
+          </w:tcPr>
+          <w:p>
+            <w:pPr>
+              <w:keepNext/>
               <w:rPr>
                 <w:rFonts w:cstheme="minorHAnsi"/>
                 <w:b/>
@@ -3605,13 +3671,13 @@
                 <w:sz w:val="20"/>
                 <w:szCs w:val="20"/>
               </w:rPr>
-              <w:t>:*</w:t>
-            </w:r>
-          </w:p>
-        </w:tc>
-        <w:tc>
-          <w:tcPr>
-            <w:tcW w:w="8306" w:type="dxa"/>
+              <w:t>{thirdPartyNum}:*</w:t>
+            </w:r>
+          </w:p>
+        </w:tc>
+        <w:tc>
+          <w:tcPr>
+            <w:tcW w:w="7382" w:type="dxa"/>
             <w:gridSpan w:val="2"/>
             <w:tcBorders>
               <w:top w:val="single" w:sz="4" w:space="0" w:color="auto"/>
@@ -3623,6 +3689,7 @@
           </w:tcPr>
           <w:p>
             <w:pPr>
+              <w:keepNext/>
               <w:rPr>
                 <w:rFonts w:cstheme="minorHAnsi"/>
                 <w:sz w:val="20"/>
@@ -3659,19 +3726,23 @@
         </w:tc>
       </w:tr>
       <w:tr>
-        <w:tc>
-          <w:tcPr>
-            <w:tcW w:w="2376" w:type="dxa"/>
-            <w:tcBorders>
-              <w:top w:val="single" w:sz="4" w:space="0" w:color="auto"/>
-              <w:left w:val="single" w:sz="4" w:space="0" w:color="auto"/>
-              <w:bottom w:val="single" w:sz="4" w:space="0" w:color="auto"/>
-              <w:right w:val="single" w:sz="4" w:space="0" w:color="auto"/>
-            </w:tcBorders>
-            <w:vAlign w:val="center"/>
-          </w:tcPr>
-          <w:p>
-            <w:pPr>
+        <w:trPr>
+          <w:cantSplit/>
+        </w:trPr>
+        <w:tc>
+          <w:tcPr>
+            <w:tcW w:w="3300" w:type="dxa"/>
+            <w:tcBorders>
+              <w:top w:val="single" w:sz="4" w:space="0" w:color="auto"/>
+              <w:left w:val="single" w:sz="4" w:space="0" w:color="auto"/>
+              <w:bottom w:val="single" w:sz="4" w:space="0" w:color="auto"/>
+              <w:right w:val="single" w:sz="4" w:space="0" w:color="auto"/>
+            </w:tcBorders>
+            <w:vAlign w:val="center"/>
+          </w:tcPr>
+          <w:p>
+            <w:pPr>
+              <w:keepNext/>
               <w:rPr>
                 <w:rFonts w:cstheme="minorHAnsi"/>
                 <w:b/>
@@ -3705,6 +3776,7 @@
           </w:tcPr>
           <w:p>
             <w:pPr>
+              <w:keepNext/>
               <w:rPr>
                 <w:rFonts w:cstheme="minorHAnsi"/>
                 <w:sz w:val="20"/>
@@ -3741,14 +3813,15 @@
         </w:tc>
         <w:tc>
           <w:tcPr>
-            <w:tcW w:w="5045" w:type="dxa"/>
-            <w:tcBorders>
-              <w:left w:val="single" w:sz="4" w:space="0" w:color="auto"/>
-            </w:tcBorders>
-            <w:vAlign w:val="center"/>
-          </w:tcPr>
-          <w:p>
-            <w:pPr>
+            <w:tcW w:w="4121" w:type="dxa"/>
+            <w:tcBorders>
+              <w:left w:val="single" w:sz="4" w:space="0" w:color="auto"/>
+            </w:tcBorders>
+            <w:vAlign w:val="center"/>
+          </w:tcPr>
+          <w:p>
+            <w:pPr>
+              <w:keepNext/>
               <w:rPr>
                 <w:rFonts w:cstheme="minorHAnsi"/>
                 <w:sz w:val="20"/>
@@ -3759,9 +3832,12 @@
         </w:tc>
       </w:tr>
       <w:tr>
-        <w:tc>
-          <w:tcPr>
-            <w:tcW w:w="2376" w:type="dxa"/>
+        <w:trPr>
+          <w:cantSplit/>
+        </w:trPr>
+        <w:tc>
+          <w:tcPr>
+            <w:tcW w:w="3300" w:type="dxa"/>
             <w:tcBorders>
               <w:top w:val="single" w:sz="4" w:space="0" w:color="auto"/>
               <w:left w:val="single" w:sz="4" w:space="0" w:color="auto"/>
@@ -3841,7 +3917,7 @@
         </w:tc>
         <w:tc>
           <w:tcPr>
-            <w:tcW w:w="5045" w:type="dxa"/>
+            <w:tcW w:w="4121" w:type="dxa"/>
             <w:tcBorders>
               <w:left w:val="single" w:sz="4" w:space="0" w:color="auto"/>
             </w:tcBorders>
@@ -3862,6 +3938,38 @@
       </w:tr>
     </w:tbl>
     <w:p/>
+    <w:p>
+      <w:pPr>
+        <w:spacing w:after="0" w:line="240" w:lineRule="auto"/>
+        <w:rPr>
+          <w:sz w:val="2"/>
+          <w:szCs w:val="2"/>
+        </w:rPr>
+      </w:pPr>
+      <w:r>
+        <w:rPr>
+          <w:sz w:val="2"/>
+          <w:szCs w:val="2"/>
+        </w:rPr>
+        <w:t>{/thirdParties}</w:t>
+      </w:r>
+    </w:p>
+    <w:p>
+      <w:pPr>
+        <w:spacing w:after="0" w:line="240" w:lineRule="auto"/>
+        <w:rPr>
+          <w:sz w:val="2"/>
+          <w:szCs w:val="2"/>
+        </w:rPr>
+      </w:pPr>
+      <w:r>
+        <w:rPr>
+          <w:sz w:val="2"/>
+          <w:szCs w:val="2"/>
+        </w:rPr>
+        <w:t>{#victims}</w:t>
+      </w:r>
+    </w:p>
     <w:tbl>
       <w:tblPr>
         <w:tblStyle w:val="Tabelacomgrade"/>
@@ -3878,47 +3986,51 @@
         <w:tblLook w:val="04A0" w:firstRow="1" w:lastRow="0" w:firstColumn="1" w:lastColumn="0" w:noHBand="0" w:noVBand="1"/>
       </w:tblPr>
       <w:tblGrid>
-        <w:gridCol w:w="2376"/>
+        <w:gridCol w:w="3300"/>
         <w:gridCol w:w="3261"/>
-        <w:gridCol w:w="5046"/>
+        <w:gridCol w:w="4121"/>
       </w:tblGrid>
       <w:tr>
-        <w:tc>
-          <w:tcPr>
-            <w:tcW w:w="2376" w:type="dxa"/>
-            <w:tcBorders>
-              <w:top w:val="single" w:sz="4" w:space="0" w:color="auto"/>
-              <w:left w:val="single" w:sz="4" w:space="0" w:color="auto"/>
-              <w:bottom w:val="single" w:sz="4" w:space="0" w:color="auto"/>
-              <w:right w:val="single" w:sz="4" w:space="0" w:color="auto"/>
-            </w:tcBorders>
-            <w:vAlign w:val="center"/>
-          </w:tcPr>
-          <w:p>
-            <w:pPr>
-              <w:rPr>
-                <w:rFonts w:cstheme="minorHAnsi"/>
-                <w:b/>
-                <w:bCs/>
-                <w:sz w:val="20"/>
-                <w:szCs w:val="20"/>
-              </w:rPr>
-            </w:pPr>
-            <w:r>
-              <w:rPr>
-                <w:rFonts w:cstheme="minorHAnsi"/>
-                <w:b/>
-                <w:bCs/>
-                <w:sz w:val="20"/>
-                <w:szCs w:val="20"/>
-              </w:rPr>
-              <w:t>*DADOS DA VÍTIMA:*</w:t>
-            </w:r>
-          </w:p>
-        </w:tc>
-        <w:tc>
-          <w:tcPr>
-            <w:tcW w:w="8307" w:type="dxa"/>
+        <w:trPr>
+          <w:cantSplit/>
+        </w:trPr>
+        <w:tc>
+          <w:tcPr>
+            <w:tcW w:w="3300" w:type="dxa"/>
+            <w:tcBorders>
+              <w:top w:val="single" w:sz="4" w:space="0" w:color="auto"/>
+              <w:left w:val="single" w:sz="4" w:space="0" w:color="auto"/>
+              <w:bottom w:val="single" w:sz="4" w:space="0" w:color="auto"/>
+              <w:right w:val="single" w:sz="4" w:space="0" w:color="auto"/>
+            </w:tcBorders>
+            <w:vAlign w:val="center"/>
+          </w:tcPr>
+          <w:p>
+            <w:pPr>
+              <w:keepNext/>
+              <w:rPr>
+                <w:rFonts w:cstheme="minorHAnsi"/>
+                <w:b/>
+                <w:bCs/>
+                <w:sz w:val="20"/>
+                <w:szCs w:val="20"/>
+              </w:rPr>
+            </w:pPr>
+            <w:r>
+              <w:rPr>
+                <w:rFonts w:cstheme="minorHAnsi"/>
+                <w:b/>
+                <w:bCs/>
+                <w:sz w:val="20"/>
+                <w:szCs w:val="20"/>
+              </w:rPr>
+              <w:t>*DADOS DA VÍTIMA{victimNum}:*</w:t>
+            </w:r>
+          </w:p>
+        </w:tc>
+        <w:tc>
+          <w:tcPr>
+            <w:tcW w:w="7382" w:type="dxa"/>
             <w:gridSpan w:val="2"/>
             <w:tcBorders>
               <w:top w:val="single" w:sz="4" w:space="0" w:color="auto"/>
@@ -3930,6 +4042,7 @@
           </w:tcPr>
           <w:p>
             <w:pPr>
+              <w:keepNext/>
               <w:rPr>
                 <w:rFonts w:cstheme="minorHAnsi"/>
                 <w:sz w:val="20"/>
@@ -3966,19 +4079,23 @@
         </w:tc>
       </w:tr>
       <w:tr>
-        <w:tc>
-          <w:tcPr>
-            <w:tcW w:w="2376" w:type="dxa"/>
-            <w:tcBorders>
-              <w:top w:val="single" w:sz="4" w:space="0" w:color="auto"/>
-              <w:left w:val="single" w:sz="4" w:space="0" w:color="auto"/>
-              <w:bottom w:val="single" w:sz="4" w:space="0" w:color="auto"/>
-              <w:right w:val="single" w:sz="4" w:space="0" w:color="auto"/>
-            </w:tcBorders>
-            <w:vAlign w:val="center"/>
-          </w:tcPr>
-          <w:p>
-            <w:pPr>
+        <w:trPr>
+          <w:cantSplit/>
+        </w:trPr>
+        <w:tc>
+          <w:tcPr>
+            <w:tcW w:w="3300" w:type="dxa"/>
+            <w:tcBorders>
+              <w:top w:val="single" w:sz="4" w:space="0" w:color="auto"/>
+              <w:left w:val="single" w:sz="4" w:space="0" w:color="auto"/>
+              <w:bottom w:val="single" w:sz="4" w:space="0" w:color="auto"/>
+              <w:right w:val="single" w:sz="4" w:space="0" w:color="auto"/>
+            </w:tcBorders>
+            <w:vAlign w:val="center"/>
+          </w:tcPr>
+          <w:p>
+            <w:pPr>
+              <w:keepNext/>
               <w:rPr>
                 <w:rFonts w:cstheme="minorHAnsi"/>
                 <w:b/>
@@ -4032,6 +4149,7 @@
           </w:tcPr>
           <w:p>
             <w:pPr>
+              <w:keepNext/>
               <w:rPr>
                 <w:rFonts w:cstheme="minorHAnsi"/>
                 <w:sz w:val="20"/>
@@ -4068,14 +4186,15 @@
         </w:tc>
         <w:tc>
           <w:tcPr>
-            <w:tcW w:w="5046" w:type="dxa"/>
-            <w:tcBorders>
-              <w:left w:val="single" w:sz="4" w:space="0" w:color="auto"/>
-            </w:tcBorders>
-            <w:vAlign w:val="center"/>
-          </w:tcPr>
-          <w:p>
-            <w:pPr>
+            <w:tcW w:w="4121" w:type="dxa"/>
+            <w:tcBorders>
+              <w:left w:val="single" w:sz="4" w:space="0" w:color="auto"/>
+            </w:tcBorders>
+            <w:vAlign w:val="center"/>
+          </w:tcPr>
+          <w:p>
+            <w:pPr>
+              <w:keepNext/>
               <w:rPr>
                 <w:rFonts w:cstheme="minorHAnsi"/>
                 <w:b/>
@@ -4088,19 +4207,23 @@
         </w:tc>
       </w:tr>
       <w:tr>
-        <w:tc>
-          <w:tcPr>
-            <w:tcW w:w="2376" w:type="dxa"/>
-            <w:tcBorders>
-              <w:top w:val="single" w:sz="4" w:space="0" w:color="auto"/>
-              <w:left w:val="single" w:sz="4" w:space="0" w:color="auto"/>
-              <w:bottom w:val="single" w:sz="4" w:space="0" w:color="auto"/>
-              <w:right w:val="single" w:sz="4" w:space="0" w:color="auto"/>
-            </w:tcBorders>
-            <w:vAlign w:val="center"/>
-          </w:tcPr>
-          <w:p>
-            <w:pPr>
+        <w:trPr>
+          <w:cantSplit/>
+        </w:trPr>
+        <w:tc>
+          <w:tcPr>
+            <w:tcW w:w="3300" w:type="dxa"/>
+            <w:tcBorders>
+              <w:top w:val="single" w:sz="4" w:space="0" w:color="auto"/>
+              <w:left w:val="single" w:sz="4" w:space="0" w:color="auto"/>
+              <w:bottom w:val="single" w:sz="4" w:space="0" w:color="auto"/>
+              <w:right w:val="single" w:sz="4" w:space="0" w:color="auto"/>
+            </w:tcBorders>
+            <w:vAlign w:val="center"/>
+          </w:tcPr>
+          <w:p>
+            <w:pPr>
+              <w:keepNext/>
               <w:rPr>
                 <w:rFonts w:cstheme="minorHAnsi"/>
                 <w:b/>
@@ -4135,6 +4258,7 @@
           </w:tcPr>
           <w:p>
             <w:pPr>
+              <w:keepNext/>
               <w:rPr>
                 <w:rFonts w:cstheme="minorHAnsi"/>
                 <w:sz w:val="20"/>
@@ -4171,14 +4295,15 @@
         </w:tc>
         <w:tc>
           <w:tcPr>
-            <w:tcW w:w="5046" w:type="dxa"/>
-            <w:tcBorders>
-              <w:left w:val="single" w:sz="4" w:space="0" w:color="auto"/>
-            </w:tcBorders>
-            <w:vAlign w:val="center"/>
-          </w:tcPr>
-          <w:p>
-            <w:pPr>
+            <w:tcW w:w="4121" w:type="dxa"/>
+            <w:tcBorders>
+              <w:left w:val="single" w:sz="4" w:space="0" w:color="auto"/>
+            </w:tcBorders>
+            <w:vAlign w:val="center"/>
+          </w:tcPr>
+          <w:p>
+            <w:pPr>
+              <w:keepNext/>
               <w:rPr>
                 <w:rFonts w:cstheme="minorHAnsi"/>
                 <w:b/>
@@ -4191,9 +4316,12 @@
         </w:tc>
       </w:tr>
       <w:tr>
-        <w:tc>
-          <w:tcPr>
-            <w:tcW w:w="2376" w:type="dxa"/>
+        <w:trPr>
+          <w:cantSplit/>
+        </w:trPr>
+        <w:tc>
+          <w:tcPr>
+            <w:tcW w:w="3300" w:type="dxa"/>
             <w:tcBorders>
               <w:top w:val="single" w:sz="4" w:space="0" w:color="auto"/>
               <w:left w:val="single" w:sz="4" w:space="0" w:color="auto"/>
@@ -4273,7 +4401,7 @@
         </w:tc>
         <w:tc>
           <w:tcPr>
-            <w:tcW w:w="5046" w:type="dxa"/>
+            <w:tcW w:w="4121" w:type="dxa"/>
             <w:tcBorders>
               <w:left w:val="single" w:sz="4" w:space="0" w:color="auto"/>
             </w:tcBorders>
@@ -4294,6 +4422,38 @@
       </w:tr>
     </w:tbl>
     <w:p/>
+    <w:p>
+      <w:pPr>
+        <w:spacing w:after="0" w:line="240" w:lineRule="auto"/>
+        <w:rPr>
+          <w:sz w:val="2"/>
+          <w:szCs w:val="2"/>
+        </w:rPr>
+      </w:pPr>
+      <w:r>
+        <w:rPr>
+          <w:sz w:val="2"/>
+          <w:szCs w:val="2"/>
+        </w:rPr>
+        <w:t>{/victims}</w:t>
+      </w:r>
+    </w:p>
+    <w:p>
+      <w:pPr>
+        <w:spacing w:after="0" w:line="240" w:lineRule="auto"/>
+        <w:rPr>
+          <w:sz w:val="2"/>
+          <w:szCs w:val="2"/>
+        </w:rPr>
+      </w:pPr>
+      <w:r>
+        <w:rPr>
+          <w:sz w:val="2"/>
+          <w:szCs w:val="2"/>
+        </w:rPr>
+        <w:t>{#witnesses}</w:t>
+      </w:r>
+    </w:p>
     <w:tbl>
       <w:tblPr>
         <w:tblStyle w:val="Tabelacomgrade"/>
@@ -4310,24 +4470,28 @@
         <w:tblLook w:val="04A0" w:firstRow="1" w:lastRow="0" w:firstColumn="1" w:lastColumn="0" w:noHBand="0" w:noVBand="1"/>
       </w:tblPr>
       <w:tblGrid>
-        <w:gridCol w:w="2660"/>
+        <w:gridCol w:w="3300"/>
         <w:gridCol w:w="2977"/>
-        <w:gridCol w:w="5045"/>
+        <w:gridCol w:w="4405"/>
       </w:tblGrid>
       <w:tr>
-        <w:tc>
-          <w:tcPr>
-            <w:tcW w:w="2660" w:type="dxa"/>
-            <w:tcBorders>
-              <w:top w:val="single" w:sz="4" w:space="0" w:color="auto"/>
-              <w:left w:val="single" w:sz="4" w:space="0" w:color="auto"/>
-              <w:bottom w:val="single" w:sz="4" w:space="0" w:color="auto"/>
-              <w:right w:val="single" w:sz="4" w:space="0" w:color="auto"/>
-            </w:tcBorders>
-            <w:vAlign w:val="center"/>
-          </w:tcPr>
-          <w:p>
-            <w:pPr>
+        <w:trPr>
+          <w:cantSplit/>
+        </w:trPr>
+        <w:tc>
+          <w:tcPr>
+            <w:tcW w:w="3300" w:type="dxa"/>
+            <w:tcBorders>
+              <w:top w:val="single" w:sz="4" w:space="0" w:color="auto"/>
+              <w:left w:val="single" w:sz="4" w:space="0" w:color="auto"/>
+              <w:bottom w:val="single" w:sz="4" w:space="0" w:color="auto"/>
+              <w:right w:val="single" w:sz="4" w:space="0" w:color="auto"/>
+            </w:tcBorders>
+            <w:vAlign w:val="center"/>
+          </w:tcPr>
+          <w:p>
+            <w:pPr>
+              <w:keepNext/>
               <w:rPr>
                 <w:rFonts w:cstheme="minorHAnsi"/>
                 <w:b/>
@@ -4364,13 +4528,13 @@
                 <w:sz w:val="20"/>
                 <w:szCs w:val="20"/>
               </w:rPr>
-              <w:t>:*</w:t>
-            </w:r>
-          </w:p>
-        </w:tc>
-        <w:tc>
-          <w:tcPr>
-            <w:tcW w:w="8022" w:type="dxa"/>
+              <w:t>{witnessNum}:*</w:t>
+            </w:r>
+          </w:p>
+        </w:tc>
+        <w:tc>
+          <w:tcPr>
+            <w:tcW w:w="7382" w:type="dxa"/>
             <w:gridSpan w:val="2"/>
             <w:tcBorders>
               <w:top w:val="single" w:sz="4" w:space="0" w:color="auto"/>
@@ -4382,6 +4546,7 @@
           </w:tcPr>
           <w:p>
             <w:pPr>
+              <w:keepNext/>
               <w:rPr>
                 <w:rFonts w:cstheme="minorHAnsi"/>
                 <w:sz w:val="20"/>
@@ -4419,22 +4584,24 @@
       </w:tr>
       <w:tr>
         <w:trPr>
+          <w:cantSplit/>
           <w:gridAfter w:val="1"/>
           <w:wAfter w:w="5045" w:type="dxa"/>
         </w:trPr>
         <w:tc>
           <w:tcPr>
-            <w:tcW w:w="2660" w:type="dxa"/>
-            <w:tcBorders>
-              <w:top w:val="single" w:sz="4" w:space="0" w:color="auto"/>
-              <w:left w:val="single" w:sz="4" w:space="0" w:color="auto"/>
-              <w:bottom w:val="single" w:sz="4" w:space="0" w:color="auto"/>
-              <w:right w:val="single" w:sz="4" w:space="0" w:color="auto"/>
-            </w:tcBorders>
-            <w:vAlign w:val="center"/>
-          </w:tcPr>
-          <w:p>
-            <w:pPr>
+            <w:tcW w:w="3300" w:type="dxa"/>
+            <w:tcBorders>
+              <w:top w:val="single" w:sz="4" w:space="0" w:color="auto"/>
+              <w:left w:val="single" w:sz="4" w:space="0" w:color="auto"/>
+              <w:bottom w:val="single" w:sz="4" w:space="0" w:color="auto"/>
+              <w:right w:val="single" w:sz="4" w:space="0" w:color="auto"/>
+            </w:tcBorders>
+            <w:vAlign w:val="center"/>
+          </w:tcPr>
+          <w:p>
+            <w:pPr>
+              <w:keepNext/>
               <w:rPr>
                 <w:rFonts w:cstheme="minorHAnsi"/>
                 <w:b/>
@@ -4488,6 +4655,7 @@
           </w:tcPr>
           <w:p>
             <w:pPr>
+              <w:keepNext/>
               <w:rPr>
                 <w:rFonts w:cstheme="minorHAnsi"/>
                 <w:sz w:val="20"/>
@@ -4525,22 +4693,24 @@
       </w:tr>
       <w:tr>
         <w:trPr>
+          <w:cantSplit/>
           <w:gridAfter w:val="1"/>
           <w:wAfter w:w="5045" w:type="dxa"/>
         </w:trPr>
         <w:tc>
           <w:tcPr>
-            <w:tcW w:w="2660" w:type="dxa"/>
-            <w:tcBorders>
-              <w:top w:val="single" w:sz="4" w:space="0" w:color="auto"/>
-              <w:left w:val="single" w:sz="4" w:space="0" w:color="auto"/>
-              <w:bottom w:val="single" w:sz="4" w:space="0" w:color="auto"/>
-              <w:right w:val="single" w:sz="4" w:space="0" w:color="auto"/>
-            </w:tcBorders>
-            <w:vAlign w:val="center"/>
-          </w:tcPr>
-          <w:p>
-            <w:pPr>
+            <w:tcW w:w="3300" w:type="dxa"/>
+            <w:tcBorders>
+              <w:top w:val="single" w:sz="4" w:space="0" w:color="auto"/>
+              <w:left w:val="single" w:sz="4" w:space="0" w:color="auto"/>
+              <w:bottom w:val="single" w:sz="4" w:space="0" w:color="auto"/>
+              <w:right w:val="single" w:sz="4" w:space="0" w:color="auto"/>
+            </w:tcBorders>
+            <w:vAlign w:val="center"/>
+          </w:tcPr>
+          <w:p>
+            <w:pPr>
+              <w:keepNext/>
               <w:rPr>
                 <w:rFonts w:cstheme="minorHAnsi"/>
                 <w:b/>
@@ -4574,6 +4744,7 @@
           </w:tcPr>
           <w:p>
             <w:pPr>
+              <w:keepNext/>
               <w:rPr>
                 <w:rFonts w:cstheme="minorHAnsi"/>
                 <w:sz w:val="20"/>
@@ -4611,12 +4782,13 @@
       </w:tr>
       <w:tr>
         <w:trPr>
+          <w:cantSplit/>
           <w:gridAfter w:val="1"/>
           <w:wAfter w:w="5045" w:type="dxa"/>
         </w:trPr>
         <w:tc>
           <w:tcPr>
-            <w:tcW w:w="2660" w:type="dxa"/>
+            <w:tcW w:w="3300" w:type="dxa"/>
             <w:tcBorders>
               <w:top w:val="single" w:sz="4" w:space="0" w:color="auto"/>
               <w:left w:val="single" w:sz="4" w:space="0" w:color="auto"/>
@@ -4697,6 +4869,22 @@
       </w:tr>
     </w:tbl>
     <w:p/>
+    <w:p>
+      <w:pPr>
+        <w:spacing w:after="0" w:line="240" w:lineRule="auto"/>
+        <w:rPr>
+          <w:sz w:val="2"/>
+          <w:szCs w:val="2"/>
+        </w:rPr>
+      </w:pPr>
+      <w:r>
+        <w:rPr>
+          <w:sz w:val="2"/>
+          <w:szCs w:val="2"/>
+        </w:rPr>
+        <w:t>{/witnesses}</w:t>
+      </w:r>
+    </w:p>
     <w:tbl>
       <w:tblPr>
         <w:tblStyle w:val="Tabelacomgrade"/>

</xml_diff>

<commit_message>
feat: add DD/MM/YYYY date field and cleaner image gallery with optional captions
- Replace the native date input with a masked DD/MM/AAAA field in the accident and occurrence generators
- Validate dates and block report generation on invalid values
- Restyle the image gallery as compact thumbnails with a small remove badge and subtle move buttons
- Add a per-image button that shows the caption field only when needed
- Show a vertical insertion line while reordering images by drag and drop
- Uppercase image captions to match the other text fields
</commit_message>
<xml_diff>
--- a/apps/acidentes/template.docx
+++ b/apps/acidentes/template.docx
@@ -5280,6 +5280,7 @@
           </w:tcPr>
           <w:p>
             <w:pPr>
+              <w:keepNext/>
               <w:jc w:val="center"/>
               <w:rPr>
                 <w:rFonts w:cstheme="minorHAnsi"/>
@@ -5329,6 +5330,8 @@
           </w:p>
           <w:p>
             <w:pPr>
+              <w:keepLines/>
+              <w:spacing w:before="0" w:after="120"/>
               <w:jc w:val="center"/>
               <w:rPr>
                 <w:rFonts w:cstheme="minorHAnsi"/>
@@ -5343,6 +5346,42 @@
                 <w:szCs w:val="20"/>
               </w:rPr>
               <w:t>{%imagem}</w:t>
+            </w:r>
+            <w:r>
+              <w:rPr>
+                <w:rFonts w:cstheme="minorHAnsi"/>
+                <w:i/>
+                <w:sz w:val="18"/>
+                <w:szCs w:val="18"/>
+              </w:rPr>
+              <w:t>{#temLegenda}</w:t>
+            </w:r>
+            <w:r>
+              <w:rPr>
+                <w:rFonts w:cstheme="minorHAnsi"/>
+                <w:i/>
+                <w:sz w:val="18"/>
+                <w:szCs w:val="18"/>
+              </w:rPr>
+              <w:br/>
+            </w:r>
+            <w:r>
+              <w:rPr>
+                <w:rFonts w:cstheme="minorHAnsi"/>
+                <w:i/>
+                <w:sz w:val="18"/>
+                <w:szCs w:val="18"/>
+              </w:rPr>
+              <w:t>{legenda}</w:t>
+            </w:r>
+            <w:r>
+              <w:rPr>
+                <w:rFonts w:cstheme="minorHAnsi"/>
+                <w:i/>
+                <w:sz w:val="18"/>
+                <w:szCs w:val="18"/>
+              </w:rPr>
+              <w:t>{/temLegenda}</w:t>
             </w:r>
           </w:p>
           <w:p>

</xml_diff>